<commit_message>
docs: add graphviz architecture, flowchart and behaviour diagrams
</commit_message>
<xml_diff>
--- a/docs/reports/网络系统综合设计-中期报告.docx
+++ b/docs/reports/网络系统综合设计-中期报告.docx
@@ -1378,13 +1378,53 @@
         <w:jc w:val="center"/>
       </w:pPr>
       <w:r>
+        <w:drawing>
+          <wp:inline xmlns:a="http://schemas.openxmlformats.org/drawingml/2006/main" xmlns:pic="http://schemas.openxmlformats.org/drawingml/2006/picture">
+            <wp:extent cx="3898628" cy="7315200"/>
+            <wp:docPr id="1" name="Picture 1"/>
+            <wp:cNvGraphicFramePr>
+              <a:graphicFrameLocks noChangeAspect="1"/>
+            </wp:cNvGraphicFramePr>
+            <a:graphic>
+              <a:graphicData uri="http://schemas.openxmlformats.org/drawingml/2006/picture">
+                <pic:pic>
+                  <pic:nvPicPr>
+                    <pic:cNvPr id="0" name="system-architecture.png"/>
+                    <pic:cNvPicPr/>
+                  </pic:nvPicPr>
+                  <pic:blipFill>
+                    <a:blip r:embed="rId9"/>
+                    <a:stretch>
+                      <a:fillRect/>
+                    </a:stretch>
+                  </pic:blipFill>
+                  <pic:spPr>
+                    <a:xfrm>
+                      <a:off x="0" y="0"/>
+                      <a:ext cx="3898628" cy="7315200"/>
+                    </a:xfrm>
+                    <a:prstGeom prst="rect"/>
+                  </pic:spPr>
+                </pic:pic>
+              </a:graphicData>
+            </a:graphic>
+          </wp:inline>
+        </w:drawing>
+      </w:r>
+    </w:p>
+    <w:p>
+      <w:pPr>
+        <w:spacing w:after="160"/>
+        <w:jc w:val="center"/>
+      </w:pPr>
+      <w:r>
         <w:rPr>
           <w:rFonts w:ascii="SimSun" w:hAnsi="SimSun" w:eastAsia="SimSun" w:cs="SimSun"/>
-          <w:b w:val="0"/>
-          <w:color w:val="808080"/>
-          <w:sz w:val="18"/>
+          <w:b/>
+          <w:color w:val="404040"/>
+          <w:sz w:val="19"/>
         </w:rPr>
-        <w:t>【系统架构流程图：详见仓库 docs/reports/中期报告.md，建议在此处插入导出的流程图】</w:t>
+        <w:t>图1 系统总体架构图</w:t>
       </w:r>
     </w:p>
     <w:p>
@@ -1397,7 +1437,61 @@
           <w:b w:val="0"/>
           <w:sz w:val="21"/>
         </w:rPr>
-        <w:t>【此处建议插入：图 1 系统总体架构图】</w:t>
+        <w:t>系统端到端的运行流程如图 2 所示：前端按帧率循环采集、缩放、压缩、打包并发送；后端按帧协议接收、解码、检测、目标级判定并在异常持续超阈值时报警。</w:t>
+      </w:r>
+    </w:p>
+    <w:p>
+      <w:pPr>
+        <w:jc w:val="center"/>
+      </w:pPr>
+      <w:r>
+        <w:drawing>
+          <wp:inline xmlns:a="http://schemas.openxmlformats.org/drawingml/2006/main" xmlns:pic="http://schemas.openxmlformats.org/drawingml/2006/picture">
+            <wp:extent cx="5199147" cy="7315200"/>
+            <wp:docPr id="2" name="Picture 2"/>
+            <wp:cNvGraphicFramePr>
+              <a:graphicFrameLocks noChangeAspect="1"/>
+            </wp:cNvGraphicFramePr>
+            <a:graphic>
+              <a:graphicData uri="http://schemas.openxmlformats.org/drawingml/2006/picture">
+                <pic:pic>
+                  <pic:nvPicPr>
+                    <pic:cNvPr id="0" name="runtime-flowchart.png"/>
+                    <pic:cNvPicPr/>
+                  </pic:nvPicPr>
+                  <pic:blipFill>
+                    <a:blip r:embed="rId10"/>
+                    <a:stretch>
+                      <a:fillRect/>
+                    </a:stretch>
+                  </pic:blipFill>
+                  <pic:spPr>
+                    <a:xfrm>
+                      <a:off x="0" y="0"/>
+                      <a:ext cx="5199147" cy="7315200"/>
+                    </a:xfrm>
+                    <a:prstGeom prst="rect"/>
+                  </pic:spPr>
+                </pic:pic>
+              </a:graphicData>
+            </a:graphic>
+          </wp:inline>
+        </w:drawing>
+      </w:r>
+    </w:p>
+    <w:p>
+      <w:pPr>
+        <w:spacing w:after="160"/>
+        <w:jc w:val="center"/>
+      </w:pPr>
+      <w:r>
+        <w:rPr>
+          <w:rFonts w:ascii="SimSun" w:hAnsi="SimSun" w:eastAsia="SimSun" w:cs="SimSun"/>
+          <w:b/>
+          <w:color w:val="404040"/>
+          <w:sz w:val="19"/>
+        </w:rPr>
+        <w:t>图2 系统运行流程图</w:t>
       </w:r>
     </w:p>
     <w:p>
@@ -2779,7 +2873,61 @@
           <w:b w:val="0"/>
           <w:sz w:val="21"/>
         </w:rPr>
-        <w:t>这一规则可解释性强：系统识别的是课堂监控画面中的"异常课堂行为"，而非医学意义上的睡眠状态，答辩时便于说明算法流程与误报控制。</w:t>
+        <w:t>这一规则可解释性强：系统识别的是课堂监控画面中的"异常课堂行为"，而非医学意义上的睡眠状态，答辩时便于说明算法流程与误报控制。行为状态映射与报警判定逻辑如图 3 所示。</w:t>
+      </w:r>
+    </w:p>
+    <w:p>
+      <w:pPr>
+        <w:jc w:val="center"/>
+      </w:pPr>
+      <w:r>
+        <w:drawing>
+          <wp:inline xmlns:a="http://schemas.openxmlformats.org/drawingml/2006/main" xmlns:pic="http://schemas.openxmlformats.org/drawingml/2006/picture">
+            <wp:extent cx="5760720" cy="2596024"/>
+            <wp:docPr id="3" name="Picture 3"/>
+            <wp:cNvGraphicFramePr>
+              <a:graphicFrameLocks noChangeAspect="1"/>
+            </wp:cNvGraphicFramePr>
+            <a:graphic>
+              <a:graphicData uri="http://schemas.openxmlformats.org/drawingml/2006/picture">
+                <pic:pic>
+                  <pic:nvPicPr>
+                    <pic:cNvPr id="0" name="behaviour-logic.png"/>
+                    <pic:cNvPicPr/>
+                  </pic:nvPicPr>
+                  <pic:blipFill>
+                    <a:blip r:embed="rId11"/>
+                    <a:stretch>
+                      <a:fillRect/>
+                    </a:stretch>
+                  </pic:blipFill>
+                  <pic:spPr>
+                    <a:xfrm>
+                      <a:off x="0" y="0"/>
+                      <a:ext cx="5760720" cy="2596024"/>
+                    </a:xfrm>
+                    <a:prstGeom prst="rect"/>
+                  </pic:spPr>
+                </pic:pic>
+              </a:graphicData>
+            </a:graphic>
+          </wp:inline>
+        </w:drawing>
+      </w:r>
+    </w:p>
+    <w:p>
+      <w:pPr>
+        <w:spacing w:after="160"/>
+        <w:jc w:val="center"/>
+      </w:pPr>
+      <w:r>
+        <w:rPr>
+          <w:rFonts w:ascii="SimSun" w:hAnsi="SimSun" w:eastAsia="SimSun" w:cs="SimSun"/>
+          <w:b/>
+          <w:color w:val="404040"/>
+          <w:sz w:val="19"/>
+        </w:rPr>
+        <w:t>图3 六类课堂行为状态映射与报警判定逻辑</w:t>
       </w:r>
     </w:p>
     <w:p>

</xml_diff>